<commit_message>
docs(readiness): Rev 3 — Postgres integration RAN e2e; fold session closures into §11.4.172 ledger
Stream M2 closed the Stream V audit gap: the pgx/PostgreSQL production
persistence path (architecture.md §4) now runs end-to-end via rootless
podman self-booting postgres:16-alpine from submodules/containers.
- 15/15 integration packages ok + -race clean (internal/store, internal/rollout)
- real-DB fault evidence: pgx TCP-kill EOF, SQLSTATE 23514 CHECK reject,
  uq_fabric_lease_active partial-unique-index lease conflict
- teardown verified clean (podman ps -a)

READINESS Rev 3 folds in all session closures: A2 (both frontends WCAG-AA),
dashboard host-render 5->9 screens + 4 states, ota-manager 1->2 screens,
types 118->85, 2 submodule bug fixes, server memory+fuzz, Postgres e2e.
Honest boundary preserved: ledger consolidates committed evidence read-only.

Co-Authored-By: Claude Opus 4.8 (1M context) <noreply@anthropic.com>
</commit_message>
<xml_diff>
--- a/docs/research/frontend_production_readiness_20260709/READINESS.docx
+++ b/docs/research/frontend_production_readiness_20260709/READINESS.docx
@@ -26,7 +26,7 @@
         <w:t xml:space="preserve"> </w:t>
       </w:r>
       <w:r>
-        <w:t xml:space="preserve">2</w:t>
+        <w:t xml:space="preserve">3</w:t>
       </w:r>
       <w:r>
         <w:t xml:space="preserve"> </w:t>
@@ -42,7 +42,7 @@
         <w:t xml:space="preserve"> </w:t>
       </w:r>
       <w:r>
-        <w:t xml:space="preserve">2026-07-09T18:43:54Z</w:t>
+        <w:t xml:space="preserve">2026-07-10T00:52:00Z</w:t>
       </w:r>
       <w:r>
         <w:t xml:space="preserve"> </w:t>
@@ -3723,6 +3723,510 @@
         <w:t xml:space="preserve">3. Production-readiness assessment (§11.4.172)</w:t>
       </w:r>
     </w:p>
+    <w:p>
+      <w:pPr>
+        <w:pStyle w:val="FirstParagraph"/>
+      </w:pPr>
+      <w:r>
+        <w:rPr>
+          <w:b/>
+          <w:bCs/>
+        </w:rPr>
+        <w:t xml:space="preserve">Rev 3 update (session close — 32 commits landed, all pushed 4/4 FF):</w:t>
+      </w:r>
+      <w:r>
+        <w:t xml:space="preserve"> </w:t>
+      </w:r>
+      <w:r>
+        <w:t xml:space="preserve">the OpenDesign</w:t>
+      </w:r>
+      <w:r>
+        <w:t xml:space="preserve"> </w:t>
+      </w:r>
+      <w:r>
+        <w:t xml:space="preserve">scope is COMPLETE and substantially hardened beyond it. Newly READY since Rev 2:</w:t>
+      </w:r>
+      <w:r>
+        <w:t xml:space="preserve"> </w:t>
+      </w:r>
+      <w:r>
+        <w:rPr>
+          <w:b/>
+          <w:bCs/>
+        </w:rPr>
+        <w:t xml:space="preserve">A2 closed</w:t>
+      </w:r>
+      <w:r>
+        <w:t xml:space="preserve"> </w:t>
+      </w:r>
+      <w:r>
+        <w:t xml:space="preserve">— ota-manager shadcn UI-boundary palette now WCAG-AA (</w:t>
+      </w:r>
+      <w:r>
+        <w:rPr>
+          <w:rStyle w:val="VerbatimChar"/>
+        </w:rPr>
+        <w:t xml:space="preserve">a8c12d9a</w:t>
+      </w:r>
+      <w:r>
+        <w:t xml:space="preserve">, 38/38</w:t>
+      </w:r>
+      <w:r>
+        <w:t xml:space="preserve"> </w:t>
+      </w:r>
+      <w:r>
+        <w:t xml:space="preserve">verified; the applier caught a rounding trap in the audit’s 2-decimal values);</w:t>
+      </w:r>
+      <w:r>
+        <w:t xml:space="preserve"> </w:t>
+      </w:r>
+      <w:r>
+        <w:rPr>
+          <w:b/>
+          <w:bCs/>
+        </w:rPr>
+        <w:t xml:space="preserve">dashboard</w:t>
+      </w:r>
+      <w:r>
+        <w:rPr>
+          <w:b/>
+          <w:bCs/>
+        </w:rPr>
+        <w:t xml:space="preserve"> </w:t>
+      </w:r>
+      <w:r>
+        <w:rPr>
+          <w:b/>
+          <w:bCs/>
+        </w:rPr>
+        <w:t xml:space="preserve">host-render matrix 5→9 screens + 4 empty/error state-variants</w:t>
+      </w:r>
+      <w:r>
+        <w:t xml:space="preserve"> </w:t>
+      </w:r>
+      <w:r>
+        <w:t xml:space="preserve">(</w:t>
+      </w:r>
+      <w:r>
+        <w:rPr>
+          <w:rStyle w:val="VerbatimChar"/>
+        </w:rPr>
+        <w:t xml:space="preserve">df2784ec</w:t>
+      </w:r>
+      <w:r>
+        <w:t xml:space="preserve">,</w:t>
+      </w:r>
+      <w:r>
+        <w:t xml:space="preserve"> </w:t>
+      </w:r>
+      <w:r>
+        <w:rPr>
+          <w:rStyle w:val="VerbatimChar"/>
+        </w:rPr>
+        <w:t xml:space="preserve">870ca9ff</w:t>
+      </w:r>
+      <w:r>
+        <w:t xml:space="preserve">,</w:t>
+      </w:r>
+      <w:r>
+        <w:t xml:space="preserve"> </w:t>
+      </w:r>
+      <w:r>
+        <w:t xml:space="preserve">81→117 pass);</w:t>
+      </w:r>
+      <w:r>
+        <w:t xml:space="preserve"> </w:t>
+      </w:r>
+      <w:r>
+        <w:rPr>
+          <w:b/>
+          <w:bCs/>
+        </w:rPr>
+        <w:t xml:space="preserve">ota-manager host-render 1→2 screens</w:t>
+      </w:r>
+      <w:r>
+        <w:t xml:space="preserve"> </w:t>
+      </w:r>
+      <w:r>
+        <w:t xml:space="preserve">(LoginPage + the shipped</w:t>
+      </w:r>
+      <w:r>
+        <w:t xml:space="preserve"> </w:t>
+      </w:r>
+      <w:r>
+        <w:rPr>
+          <w:rStyle w:val="VerbatimChar"/>
+        </w:rPr>
+        <w:t xml:space="preserve">/dashboard</w:t>
+      </w:r>
+      <w:r>
+        <w:t xml:space="preserve">,</w:t>
+      </w:r>
+      <w:r>
+        <w:t xml:space="preserve"> </w:t>
+      </w:r>
+      <w:r>
+        <w:rPr>
+          <w:rStyle w:val="VerbatimChar"/>
+        </w:rPr>
+        <w:t xml:space="preserve">01947d8e</w:t>
+      </w:r>
+      <w:r>
+        <w:t xml:space="preserve">);</w:t>
+      </w:r>
+      <w:r>
+        <w:t xml:space="preserve"> </w:t>
+      </w:r>
+      <w:r>
+        <w:rPr>
+          <w:b/>
+          <w:bCs/>
+        </w:rPr>
+        <w:t xml:space="preserve">ota-manager type errors 118→85</w:t>
+      </w:r>
+      <w:r>
+        <w:t xml:space="preserve"> </w:t>
+      </w:r>
+      <w:r>
+        <w:t xml:space="preserve">(</w:t>
+      </w:r>
+      <w:r>
+        <w:rPr>
+          <w:rStyle w:val="VerbatimChar"/>
+        </w:rPr>
+        <w:t xml:space="preserve">34f7dcf6</w:t>
+      </w:r>
+      <w:r>
+        <w:t xml:space="preserve">, remaining 85 all operator-gated</w:t>
+      </w:r>
+      <w:r>
+        <w:t xml:space="preserve"> </w:t>
+      </w:r>
+      <w:r>
+        <w:t xml:space="preserve">router cluster);</w:t>
+      </w:r>
+      <w:r>
+        <w:t xml:space="preserve"> </w:t>
+      </w:r>
+      <w:r>
+        <w:rPr>
+          <w:b/>
+          <w:bCs/>
+        </w:rPr>
+        <w:t xml:space="preserve">2 real submodule bugs fixed</w:t>
+      </w:r>
+      <w:r>
+        <w:t xml:space="preserve"> </w:t>
+      </w:r>
+      <w:r>
+        <w:t xml:space="preserve">(</w:t>
+      </w:r>
+      <w:r>
+        <w:rPr>
+          <w:rStyle w:val="VerbatimChar"/>
+        </w:rPr>
+        <w:t xml:space="preserve">challenges</w:t>
+      </w:r>
+      <w:r>
+        <w:t xml:space="preserve"> </w:t>
+      </w:r>
+      <w:r>
+        <w:rPr>
+          <w:rStyle w:val="VerbatimChar"/>
+        </w:rPr>
+        <w:t xml:space="preserve">RecordAction</w:t>
+      </w:r>
+      <w:r>
+        <w:t xml:space="preserve"> </w:t>
+      </w:r>
+      <w:r>
+        <w:t xml:space="preserve">race +</w:t>
+      </w:r>
+      <w:r>
+        <w:t xml:space="preserve"> </w:t>
+      </w:r>
+      <w:r>
+        <w:rPr>
+          <w:rStyle w:val="VerbatimChar"/>
+        </w:rPr>
+        <w:t xml:space="preserve">llms_verifier</w:t>
+      </w:r>
+      <w:r>
+        <w:t xml:space="preserve"> </w:t>
+      </w:r>
+      <w:r>
+        <w:t xml:space="preserve">RED,</w:t>
+      </w:r>
+      <w:r>
+        <w:t xml:space="preserve"> </w:t>
+      </w:r>
+      <w:r>
+        <w:rPr>
+          <w:rStyle w:val="VerbatimChar"/>
+        </w:rPr>
+        <w:t xml:space="preserve">f553104f</w:t>
+      </w:r>
+      <w:r>
+        <w:t xml:space="preserve">/</w:t>
+      </w:r>
+      <w:r>
+        <w:rPr>
+          <w:rStyle w:val="VerbatimChar"/>
+        </w:rPr>
+        <w:t xml:space="preserve">5a3e036a</w:t>
+      </w:r>
+      <w:r>
+        <w:t xml:space="preserve">);</w:t>
+      </w:r>
+      <w:r>
+        <w:t xml:space="preserve"> </w:t>
+      </w:r>
+      <w:r>
+        <w:rPr>
+          <w:b/>
+          <w:bCs/>
+        </w:rPr>
+        <w:t xml:space="preserve">server §11.4.169 memory + fuzzing gaps</w:t>
+      </w:r>
+      <w:r>
+        <w:rPr>
+          <w:b/>
+          <w:bCs/>
+        </w:rPr>
+        <w:t xml:space="preserve"> </w:t>
+      </w:r>
+      <w:r>
+        <w:rPr>
+          <w:b/>
+          <w:bCs/>
+        </w:rPr>
+        <w:t xml:space="preserve">closed</w:t>
+      </w:r>
+      <w:r>
+        <w:t xml:space="preserve"> </w:t>
+      </w:r>
+      <w:r>
+        <w:t xml:space="preserve">(</w:t>
+      </w:r>
+      <w:r>
+        <w:rPr>
+          <w:rStyle w:val="VerbatimChar"/>
+        </w:rPr>
+        <w:t xml:space="preserve">f82a77e4</w:t>
+      </w:r>
+      <w:r>
+        <w:t xml:space="preserve"> </w:t>
+      </w:r>
+      <w:r>
+        <w:t xml:space="preserve">— 4,800-req heap-growth assertion +</w:t>
+      </w:r>
+      <w:r>
+        <w:t xml:space="preserve"> </w:t>
+      </w:r>
+      <w:r>
+        <w:rPr>
+          <w:rStyle w:val="VerbatimChar"/>
+        </w:rPr>
+        <w:t xml:space="preserve">FuzzTokenSignerVerify</w:t>
+      </w:r>
+      <w:r>
+        <w:t xml:space="preserve"> </w:t>
+      </w:r>
+      <w:r>
+        <w:t xml:space="preserve">319k execs</w:t>
+      </w:r>
+      <w:r>
+        <w:t xml:space="preserve"> </w:t>
+      </w:r>
+      <w:r>
+        <w:t xml:space="preserve">0 crashes, both with FAIL-proofs) atop a full coverage audit (</w:t>
+      </w:r>
+      <w:r>
+        <w:rPr>
+          <w:rStyle w:val="VerbatimChar"/>
+        </w:rPr>
+        <w:t xml:space="preserve">ca3860d8</w:t>
+      </w:r>
+      <w:r>
+        <w:t xml:space="preserve">, suite 100% PASS /</w:t>
+      </w:r>
+      <w:r>
+        <w:t xml:space="preserve"> </w:t>
+      </w:r>
+      <w:r>
+        <w:t xml:space="preserve">0 races); and — closing the Stream V audit gap where the Postgres suite previously only</w:t>
+      </w:r>
+      <w:r>
+        <w:t xml:space="preserve"> </w:t>
+      </w:r>
+      <w:r>
+        <w:t xml:space="preserve">type-checked — the</w:t>
+      </w:r>
+      <w:r>
+        <w:t xml:space="preserve"> </w:t>
+      </w:r>
+      <w:r>
+        <w:rPr>
+          <w:b/>
+          <w:bCs/>
+        </w:rPr>
+        <w:t xml:space="preserve">pgx/PostgreSQL production persistence path is now RAN end-to-end</w:t>
+      </w:r>
+      <w:r>
+        <w:t xml:space="preserve"> </w:t>
+      </w:r>
+      <w:r>
+        <w:t xml:space="preserve">(self-booting</w:t>
+      </w:r>
+      <w:r>
+        <w:t xml:space="preserve"> </w:t>
+      </w:r>
+      <w:r>
+        <w:rPr>
+          <w:rStyle w:val="VerbatimChar"/>
+        </w:rPr>
+        <w:t xml:space="preserve">postgres:16-alpine</w:t>
+      </w:r>
+      <w:r>
+        <w:t xml:space="preserve"> </w:t>
+      </w:r>
+      <w:r>
+        <w:t xml:space="preserve">via rootless podman from the</w:t>
+      </w:r>
+      <w:r>
+        <w:t xml:space="preserve"> </w:t>
+      </w:r>
+      <w:r>
+        <w:rPr>
+          <w:rStyle w:val="VerbatimChar"/>
+        </w:rPr>
+        <w:t xml:space="preserve">submodules/containers</w:t>
+      </w:r>
+      <w:r>
+        <w:t xml:space="preserve"> </w:t>
+      </w:r>
+      <w:r>
+        <w:t xml:space="preserve">brick; 15/15 integration packages</w:t>
+      </w:r>
+      <w:r>
+        <w:t xml:space="preserve"> </w:t>
+      </w:r>
+      <w:r>
+        <w:rPr>
+          <w:rStyle w:val="VerbatimChar"/>
+        </w:rPr>
+        <w:t xml:space="preserve">ok</w:t>
+      </w:r>
+      <w:r>
+        <w:t xml:space="preserve"> </w:t>
+      </w:r>
+      <w:r>
+        <w:t xml:space="preserve">+</w:t>
+      </w:r>
+      <w:r>
+        <w:t xml:space="preserve"> </w:t>
+      </w:r>
+      <w:r>
+        <w:rPr>
+          <w:rStyle w:val="VerbatimChar"/>
+        </w:rPr>
+        <w:t xml:space="preserve">-race</w:t>
+      </w:r>
+      <w:r>
+        <w:t xml:space="preserve"> </w:t>
+      </w:r>
+      <w:r>
+        <w:t xml:space="preserve">clean; real fault-injection evidence —</w:t>
+      </w:r>
+      <w:r>
+        <w:t xml:space="preserve"> </w:t>
+      </w:r>
+      <w:r>
+        <w:t xml:space="preserve">live TCP-kill pgx errors, a real</w:t>
+      </w:r>
+      <w:r>
+        <w:t xml:space="preserve"> </w:t>
+      </w:r>
+      <w:r>
+        <w:rPr>
+          <w:rStyle w:val="VerbatimChar"/>
+        </w:rPr>
+        <w:t xml:space="preserve">SQLSTATE 23514</w:t>
+      </w:r>
+      <w:r>
+        <w:t xml:space="preserve"> </w:t>
+      </w:r>
+      <w:r>
+        <w:t xml:space="preserve">CHECK rejection, a real</w:t>
+      </w:r>
+      <w:r>
+        <w:t xml:space="preserve"> </w:t>
+      </w:r>
+      <w:r>
+        <w:rPr>
+          <w:rStyle w:val="VerbatimChar"/>
+        </w:rPr>
+        <w:t xml:space="preserve">uq_fabric_lease_active</w:t>
+      </w:r>
+      <w:r>
+        <w:t xml:space="preserve"> </w:t>
+      </w:r>
+      <w:r>
+        <w:t xml:space="preserve">partial-unique-index conflict;</w:t>
+      </w:r>
+      <w:r>
+        <w:t xml:space="preserve"> </w:t>
+      </w:r>
+      <w:r>
+        <w:rPr>
+          <w:rStyle w:val="VerbatimChar"/>
+        </w:rPr>
+        <w:t xml:space="preserve">docs/qa/20260709-server-postgres-integration/EVIDENCE.md</w:t>
+      </w:r>
+      <w:r>
+        <w:t xml:space="preserve">).</w:t>
+      </w:r>
+      <w:r>
+        <w:t xml:space="preserve"> </w:t>
+      </w:r>
+      <w:r>
+        <w:t xml:space="preserve">The remaining highest-value items are</w:t>
+      </w:r>
+      <w:r>
+        <w:t xml:space="preserve"> </w:t>
+      </w:r>
+      <w:r>
+        <w:rPr>
+          <w:b/>
+          <w:bCs/>
+        </w:rPr>
+        <w:t xml:space="preserve">operator-gated decisions</w:t>
+      </w:r>
+      <w:r>
+        <w:t xml:space="preserve"> </w:t>
+      </w:r>
+      <w:r>
+        <w:t xml:space="preserve">(see §3.2 /</w:t>
+      </w:r>
+      <w:r>
+        <w:t xml:space="preserve"> </w:t>
+      </w:r>
+      <w:r>
+        <w:t xml:space="preserve">§4), not autonomous work: router-wiring (C), guard-hook regex via the constitution workflow</w:t>
+      </w:r>
+      <w:r>
+        <w:t xml:space="preserve"> </w:t>
+      </w:r>
+      <w:r>
+        <w:t xml:space="preserve">(D), security-response-header middleware (O), DDoS default posture (Q), OpenDesign daemon</w:t>
+      </w:r>
+      <w:r>
+        <w:t xml:space="preserve"> </w:t>
+      </w:r>
+      <w:r>
+        <w:t xml:space="preserve">(G). Per §11.4.185, none of this ships until the QA team’s manual confirmation.</w:t>
+      </w:r>
+    </w:p>
     <w:bookmarkStart w:id="17" w:name="production-ready-now"/>
     <w:p>
       <w:pPr>
@@ -3949,18 +4453,92 @@
               <w:pStyle w:val="Compact"/>
             </w:pPr>
             <w:r>
-              <w:t xml:space="preserve">READY (partial coverage)</w:t>
-            </w:r>
-          </w:p>
-        </w:tc>
-        <w:tc>
-          <w:tcPr/>
-          <w:p>
-            <w:pPr>
-              <w:pStyle w:val="Compact"/>
-            </w:pPr>
-            <w:r>
-              <w:t xml:space="preserve">§2 sub-matrix — self-validated dual oracle live on both; 1 (ota-manager) + 5 (dashboard) screens proven.</w:t>
+              <w:t xml:space="preserve">READY (expanded)</w:t>
+            </w:r>
+          </w:p>
+        </w:tc>
+        <w:tc>
+          <w:tcPr/>
+          <w:p>
+            <w:pPr>
+              <w:pStyle w:val="Compact"/>
+            </w:pPr>
+            <w:r>
+              <w:t xml:space="preserve">self-validated dual oracle live on both;</w:t>
+            </w:r>
+            <w:r>
+              <w:t xml:space="preserve"> </w:t>
+            </w:r>
+            <w:r>
+              <w:rPr>
+                <w:b/>
+                <w:bCs/>
+              </w:rPr>
+              <w:t xml:space="preserve">ota-manager 2 screens</w:t>
+            </w:r>
+            <w:r>
+              <w:t xml:space="preserve"> </w:t>
+            </w:r>
+            <w:r>
+              <w:t xml:space="preserve">(LoginPage + shipped</w:t>
+            </w:r>
+            <w:r>
+              <w:t xml:space="preserve"> </w:t>
+            </w:r>
+            <w:r>
+              <w:rPr>
+                <w:rStyle w:val="VerbatimChar"/>
+              </w:rPr>
+              <w:t xml:space="preserve">/dashboard</w:t>
+            </w:r>
+            <w:r>
+              <w:t xml:space="preserve">,</w:t>
+            </w:r>
+            <w:r>
+              <w:t xml:space="preserve"> </w:t>
+            </w:r>
+            <w:r>
+              <w:rPr>
+                <w:rStyle w:val="VerbatimChar"/>
+              </w:rPr>
+              <w:t xml:space="preserve">01947d8e</w:t>
+            </w:r>
+            <w:r>
+              <w:t xml:space="preserve">),</w:t>
+            </w:r>
+            <w:r>
+              <w:t xml:space="preserve"> </w:t>
+            </w:r>
+            <w:r>
+              <w:rPr>
+                <w:b/>
+                <w:bCs/>
+              </w:rPr>
+              <w:t xml:space="preserve">dashboard 9 screens + 4 empty/error state-variants</w:t>
+            </w:r>
+            <w:r>
+              <w:t xml:space="preserve"> </w:t>
+            </w:r>
+            <w:r>
+              <w:t xml:space="preserve">(</w:t>
+            </w:r>
+            <w:r>
+              <w:rPr>
+                <w:rStyle w:val="VerbatimChar"/>
+              </w:rPr>
+              <w:t xml:space="preserve">df2784ec</w:t>
+            </w:r>
+            <w:r>
+              <w:t xml:space="preserve">/</w:t>
+            </w:r>
+            <w:r>
+              <w:rPr>
+                <w:rStyle w:val="VerbatimChar"/>
+              </w:rPr>
+              <w:t xml:space="preserve">870ca9ff</w:t>
+            </w:r>
+            <w:r>
+              <w:t xml:space="preserve">).</w:t>
             </w:r>
           </w:p>
         </w:tc>
@@ -3973,7 +4551,7 @@
               <w:pStyle w:val="Compact"/>
             </w:pPr>
             <w:r>
-              <w:t xml:space="preserve">Server SPA-serve seam (asset chain + asset-aware 404)</w:t>
+              <w:t xml:space="preserve">ota-manager shadcn UI-boundary palette WCAG-AA (A2)</w:t>
             </w:r>
           </w:p>
         </w:tc>
@@ -3998,13 +4576,438 @@
               <w:rPr>
                 <w:rStyle w:val="VerbatimChar"/>
               </w:rPr>
+              <w:t xml:space="preserve">a8c12d9a</w:t>
+            </w:r>
+            <w:r>
+              <w:t xml:space="preserve"> </w:t>
+            </w:r>
+            <w:r>
+              <w:t xml:space="preserve">—</w:t>
+            </w:r>
+            <w:r>
+              <w:t xml:space="preserve"> </w:t>
+            </w:r>
+            <w:r>
+              <w:rPr>
+                <w:rStyle w:val="VerbatimChar"/>
+              </w:rPr>
+              <w:t xml:space="preserve">--border</w:t>
+            </w:r>
+            <w:r>
+              <w:t xml:space="preserve">/</w:t>
+            </w:r>
+            <w:r>
+              <w:rPr>
+                <w:rStyle w:val="VerbatimChar"/>
+              </w:rPr>
+              <w:t xml:space="preserve">--input</w:t>
+            </w:r>
+            <w:r>
+              <w:t xml:space="preserve">/</w:t>
+            </w:r>
+            <w:r>
+              <w:rPr>
+                <w:rStyle w:val="VerbatimChar"/>
+              </w:rPr>
+              <w:t xml:space="preserve">--ring</w:t>
+            </w:r>
+            <w:r>
+              <w:t xml:space="preserve">/</w:t>
+            </w:r>
+            <w:r>
+              <w:rPr>
+                <w:rStyle w:val="VerbatimChar"/>
+              </w:rPr>
+              <w:t xml:space="preserve">--sidebar-border</w:t>
+            </w:r>
+            <w:r>
+              <w:t xml:space="preserve"> </w:t>
+            </w:r>
+            <w:r>
+              <w:t xml:space="preserve">both themes ≥3:1, 38/38 verified, host-render self-validated.</w:t>
+            </w:r>
+          </w:p>
+        </w:tc>
+      </w:tr>
+      <w:tr>
+        <w:tc>
+          <w:tcPr/>
+          <w:p>
+            <w:pPr>
+              <w:pStyle w:val="Compact"/>
+            </w:pPr>
+            <w:r>
+              <w:t xml:space="preserve">Server SPA-serve seam + memory + fuzz coverage</w:t>
+            </w:r>
+          </w:p>
+        </w:tc>
+        <w:tc>
+          <w:tcPr/>
+          <w:p>
+            <w:pPr>
+              <w:pStyle w:val="Compact"/>
+            </w:pPr>
+            <w:r>
+              <w:t xml:space="preserve">READY</w:t>
+            </w:r>
+          </w:p>
+        </w:tc>
+        <w:tc>
+          <w:tcPr/>
+          <w:p>
+            <w:pPr>
+              <w:pStyle w:val="Compact"/>
+            </w:pPr>
+            <w:r>
+              <w:rPr>
+                <w:rStyle w:val="VerbatimChar"/>
+              </w:rPr>
               <w:t xml:space="preserve">embed_test.go</w:t>
             </w:r>
             <w:r>
               <w:t xml:space="preserve"> </w:t>
             </w:r>
             <w:r>
-              <w:t xml:space="preserve">5 real-router tests.</w:t>
+              <w:t xml:space="preserve">5 real-router tests +</w:t>
+            </w:r>
+            <w:r>
+              <w:t xml:space="preserve"> </w:t>
+            </w:r>
+            <w:r>
+              <w:rPr>
+                <w:rStyle w:val="VerbatimChar"/>
+              </w:rPr>
+              <w:t xml:space="preserve">604c0508</w:t>
+            </w:r>
+            <w:r>
+              <w:t xml:space="preserve"> </w:t>
+            </w:r>
+            <w:r>
+              <w:t xml:space="preserve">stress+chaos +</w:t>
+            </w:r>
+            <w:r>
+              <w:t xml:space="preserve"> </w:t>
+            </w:r>
+            <w:r>
+              <w:rPr>
+                <w:rStyle w:val="VerbatimChar"/>
+              </w:rPr>
+              <w:t xml:space="preserve">f82a77e4</w:t>
+            </w:r>
+            <w:r>
+              <w:t xml:space="preserve"> </w:t>
+            </w:r>
+            <w:r>
+              <w:t xml:space="preserve">heap-growth assertion +</w:t>
+            </w:r>
+            <w:r>
+              <w:t xml:space="preserve"> </w:t>
+            </w:r>
+            <w:r>
+              <w:rPr>
+                <w:rStyle w:val="VerbatimChar"/>
+              </w:rPr>
+              <w:t xml:space="preserve">FuzzTokenSignerVerify</w:t>
+            </w:r>
+            <w:r>
+              <w:t xml:space="preserve"> </w:t>
+            </w:r>
+            <w:r>
+              <w:t xml:space="preserve">(319k execs, 0 crashes).</w:t>
+            </w:r>
+          </w:p>
+        </w:tc>
+      </w:tr>
+      <w:tr>
+        <w:tc>
+          <w:tcPr/>
+          <w:p>
+            <w:pPr>
+              <w:pStyle w:val="Compact"/>
+            </w:pPr>
+            <w:r>
+              <w:t xml:space="preserve">Owned submodule bricks health</w:t>
+            </w:r>
+          </w:p>
+        </w:tc>
+        <w:tc>
+          <w:tcPr/>
+          <w:p>
+            <w:pPr>
+              <w:pStyle w:val="Compact"/>
+            </w:pPr>
+            <w:r>
+              <w:t xml:space="preserve">READY (12 green + 2 fixed)</w:t>
+            </w:r>
+          </w:p>
+        </w:tc>
+        <w:tc>
+          <w:tcPr/>
+          <w:p>
+            <w:pPr>
+              <w:pStyle w:val="Compact"/>
+            </w:pPr>
+            <w:r>
+              <w:rPr>
+                <w:rStyle w:val="VerbatimChar"/>
+              </w:rPr>
+              <w:t xml:space="preserve">95d8328e</w:t>
+            </w:r>
+            <w:r>
+              <w:t xml:space="preserve"> </w:t>
+            </w:r>
+            <w:r>
+              <w:t xml:space="preserve">audit;</w:t>
+            </w:r>
+            <w:r>
+              <w:t xml:space="preserve"> </w:t>
+            </w:r>
+            <w:r>
+              <w:rPr>
+                <w:rStyle w:val="VerbatimChar"/>
+              </w:rPr>
+              <w:t xml:space="preserve">challenges</w:t>
+            </w:r>
+            <w:r>
+              <w:t xml:space="preserve"> </w:t>
+            </w:r>
+            <w:r>
+              <w:t xml:space="preserve">race + FAIL-bluff fixed (</w:t>
+            </w:r>
+            <w:r>
+              <w:rPr>
+                <w:rStyle w:val="VerbatimChar"/>
+              </w:rPr>
+              <w:t xml:space="preserve">f553104f</w:t>
+            </w:r>
+            <w:r>
+              <w:t xml:space="preserve">),</w:t>
+            </w:r>
+            <w:r>
+              <w:t xml:space="preserve"> </w:t>
+            </w:r>
+            <w:r>
+              <w:rPr>
+                <w:rStyle w:val="VerbatimChar"/>
+              </w:rPr>
+              <w:t xml:space="preserve">llms_verifier</w:t>
+            </w:r>
+            <w:r>
+              <w:t xml:space="preserve"> </w:t>
+            </w:r>
+            <w:r>
+              <w:t xml:space="preserve">RED fixed (</w:t>
+            </w:r>
+            <w:r>
+              <w:rPr>
+                <w:rStyle w:val="VerbatimChar"/>
+              </w:rPr>
+              <w:t xml:space="preserve">5a3e036a</w:t>
+            </w:r>
+            <w:r>
+              <w:t xml:space="preserve">).</w:t>
+            </w:r>
+          </w:p>
+        </w:tc>
+      </w:tr>
+      <w:tr>
+        <w:tc>
+          <w:tcPr/>
+          <w:p>
+            <w:pPr>
+              <w:pStyle w:val="Compact"/>
+            </w:pPr>
+            <w:r>
+              <w:t xml:space="preserve">Server</w:t>
+            </w:r>
+            <w:r>
+              <w:t xml:space="preserve"> </w:t>
+            </w:r>
+            <w:r>
+              <w:rPr>
+                <w:b/>
+                <w:bCs/>
+              </w:rPr>
+              <w:t xml:space="preserve">pgx/PostgreSQL</w:t>
+            </w:r>
+            <w:r>
+              <w:t xml:space="preserve"> </w:t>
+            </w:r>
+            <w:r>
+              <w:t xml:space="preserve">production persistence path (architecture.md §4)</w:t>
+            </w:r>
+          </w:p>
+        </w:tc>
+        <w:tc>
+          <w:tcPr/>
+          <w:p>
+            <w:pPr>
+              <w:pStyle w:val="Compact"/>
+            </w:pPr>
+            <w:r>
+              <w:t xml:space="preserve">READY (RAN e2e)</w:t>
+            </w:r>
+          </w:p>
+        </w:tc>
+        <w:tc>
+          <w:tcPr/>
+          <w:p>
+            <w:pPr>
+              <w:pStyle w:val="Compact"/>
+            </w:pPr>
+            <w:r>
+              <w:rPr>
+                <w:rStyle w:val="VerbatimChar"/>
+              </w:rPr>
+              <w:t xml:space="preserve">docs/qa/20260709-server-postgres-integration/EVIDENCE.md</w:t>
+            </w:r>
+            <w:r>
+              <w:t xml:space="preserve"> </w:t>
+            </w:r>
+            <w:r>
+              <w:t xml:space="preserve">— self-booting</w:t>
+            </w:r>
+            <w:r>
+              <w:t xml:space="preserve"> </w:t>
+            </w:r>
+            <w:r>
+              <w:rPr>
+                <w:rStyle w:val="VerbatimChar"/>
+              </w:rPr>
+              <w:t xml:space="preserve">postgres:16-alpine</w:t>
+            </w:r>
+            <w:r>
+              <w:t xml:space="preserve"> </w:t>
+            </w:r>
+            <w:r>
+              <w:t xml:space="preserve">via rootless podman (</w:t>
+            </w:r>
+            <w:r>
+              <w:rPr>
+                <w:rStyle w:val="VerbatimChar"/>
+              </w:rPr>
+              <w:t xml:space="preserve">submodules/containers</w:t>
+            </w:r>
+            <w:r>
+              <w:t xml:space="preserve">, §11.4.161);</w:t>
+            </w:r>
+            <w:r>
+              <w:t xml:space="preserve"> </w:t>
+            </w:r>
+            <w:r>
+              <w:rPr>
+                <w:rStyle w:val="VerbatimChar"/>
+              </w:rPr>
+              <w:t xml:space="preserve">go test -tags integration ./...</w:t>
+            </w:r>
+            <w:r>
+              <w:t xml:space="preserve"> </w:t>
+            </w:r>
+            <w:r>
+              <w:rPr>
+                <w:b/>
+                <w:bCs/>
+              </w:rPr>
+              <w:t xml:space="preserve">15/15</w:t>
+            </w:r>
+            <w:r>
+              <w:rPr>
+                <w:b/>
+                <w:bCs/>
+              </w:rPr>
+              <w:t xml:space="preserve"> </w:t>
+            </w:r>
+            <w:r>
+              <w:rPr>
+                <w:rStyle w:val="VerbatimChar"/>
+                <w:b/>
+                <w:bCs/>
+              </w:rPr>
+              <w:t xml:space="preserve">ok</w:t>
+            </w:r>
+            <w:r>
+              <w:t xml:space="preserve"> </w:t>
+            </w:r>
+            <w:r>
+              <w:t xml:space="preserve">+</w:t>
+            </w:r>
+            <w:r>
+              <w:t xml:space="preserve"> </w:t>
+            </w:r>
+            <w:r>
+              <w:rPr>
+                <w:rStyle w:val="VerbatimChar"/>
+              </w:rPr>
+              <w:t xml:space="preserve">-race</w:t>
+            </w:r>
+            <w:r>
+              <w:t xml:space="preserve"> </w:t>
+            </w:r>
+            <w:r>
+              <w:t xml:space="preserve">clean on</w:t>
+            </w:r>
+            <w:r>
+              <w:t xml:space="preserve"> </w:t>
+            </w:r>
+            <w:r>
+              <w:rPr>
+                <w:rStyle w:val="VerbatimChar"/>
+              </w:rPr>
+              <w:t xml:space="preserve">internal/store</w:t>
+            </w:r>
+            <w:r>
+              <w:t xml:space="preserve">+</w:t>
+            </w:r>
+            <w:r>
+              <w:rPr>
+                <w:rStyle w:val="VerbatimChar"/>
+              </w:rPr>
+              <w:t xml:space="preserve">internal/rollout</w:t>
+            </w:r>
+            <w:r>
+              <w:t xml:space="preserve">; real-DB fault evidence (pgx TCP-kill EOF,</w:t>
+            </w:r>
+            <w:r>
+              <w:t xml:space="preserve"> </w:t>
+            </w:r>
+            <w:r>
+              <w:rPr>
+                <w:rStyle w:val="VerbatimChar"/>
+              </w:rPr>
+              <w:t xml:space="preserve">SQLSTATE 23514</w:t>
+            </w:r>
+            <w:r>
+              <w:t xml:space="preserve"> </w:t>
+            </w:r>
+            <w:r>
+              <w:t xml:space="preserve">CHECK,</w:t>
+            </w:r>
+            <w:r>
+              <w:t xml:space="preserve"> </w:t>
+            </w:r>
+            <w:r>
+              <w:rPr>
+                <w:rStyle w:val="VerbatimChar"/>
+              </w:rPr>
+              <w:t xml:space="preserve">uq_fabric_lease_active</w:t>
+            </w:r>
+            <w:r>
+              <w:t xml:space="preserve"> </w:t>
+            </w:r>
+            <w:r>
+              <w:t xml:space="preserve">lease conflict); teardown verified (</w:t>
+            </w:r>
+            <w:r>
+              <w:rPr>
+                <w:rStyle w:val="VerbatimChar"/>
+              </w:rPr>
+              <w:t xml:space="preserve">podman ps -a</w:t>
+            </w:r>
+            <w:r>
+              <w:t xml:space="preserve"> </w:t>
+            </w:r>
+            <w:r>
+              <w:t xml:space="preserve">clean). No product bug.</w:t>
             </w:r>
           </w:p>
         </w:tc>
@@ -4082,37 +5085,231 @@
                 <w:b/>
                 <w:bCs/>
               </w:rPr>
-              <w:t xml:space="preserve">WCAG token-contrast re-vendor</w:t>
-            </w:r>
-          </w:p>
-        </w:tc>
-        <w:tc>
-          <w:tcPr/>
-          <w:p>
-            <w:pPr>
-              <w:pStyle w:val="Compact"/>
-            </w:pPr>
+              <w:t xml:space="preserve">WCAG contrast — DONE for BOTH frontends</w:t>
+            </w:r>
+          </w:p>
+        </w:tc>
+        <w:tc>
+          <w:tcPr/>
+          <w:p>
+            <w:pPr>
+              <w:pStyle w:val="Compact"/>
+            </w:pPr>
+            <w:r>
+              <w:t xml:space="preserve">dashboard tokens (</w:t>
+            </w:r>
+            <w:r>
+              <w:rPr>
+                <w:rStyle w:val="VerbatimChar"/>
+              </w:rPr>
+              <w:t xml:space="preserve">dbc20d51</w:t>
+            </w:r>
+            <w:r>
+              <w:t xml:space="preserve">+</w:t>
+            </w:r>
+            <w:r>
+              <w:rPr>
+                <w:rStyle w:val="VerbatimChar"/>
+              </w:rPr>
+              <w:t xml:space="preserve">cdce12c7</w:t>
+            </w:r>
+            <w:r>
+              <w:t xml:space="preserve">)</w:t>
+            </w:r>
+            <w:r>
+              <w:t xml:space="preserve"> </w:t>
+            </w:r>
             <w:r>
               <w:rPr>
                 <w:b/>
                 <w:bCs/>
               </w:rPr>
-              <w:t xml:space="preserve">DONE for dashboard</w:t>
-            </w:r>
-            <w:r>
-              <w:t xml:space="preserve"> </w:t>
-            </w:r>
-            <w:r>
-              <w:t xml:space="preserve">(</w:t>
-            </w:r>
-            <w:r>
-              <w:rPr>
-                <w:rStyle w:val="VerbatimChar"/>
-              </w:rPr>
-              <w:t xml:space="preserve">dbc20d51</w:t>
-            </w:r>
-            <w:r>
-              <w:t xml:space="preserve">+</w:t>
+              <w:t xml:space="preserve">AND</w:t>
+            </w:r>
+            <w:r>
+              <w:t xml:space="preserve"> </w:t>
+            </w:r>
+            <w:r>
+              <w:t xml:space="preserve">ota-manager shadcn UI-boundary (</w:t>
+            </w:r>
+            <w:r>
+              <w:rPr>
+                <w:rStyle w:val="VerbatimChar"/>
+              </w:rPr>
+              <w:t xml:space="preserve">a8c12d9a</w:t>
+            </w:r>
+            <w:r>
+              <w:t xml:space="preserve">, A2 closed)</w:t>
+            </w:r>
+          </w:p>
+        </w:tc>
+        <w:tc>
+          <w:tcPr/>
+          <w:p>
+            <w:pPr>
+              <w:pStyle w:val="Compact"/>
+            </w:pPr>
+            <w:r>
+              <w:t xml:space="preserve">Landed: all three token copies byte-identical (</w:t>
+            </w:r>
+            <w:r>
+              <w:rPr>
+                <w:rStyle w:val="VerbatimChar"/>
+              </w:rPr>
+              <w:t xml:space="preserve">cmp</w:t>
+            </w:r>
+            <w:r>
+              <w:t xml:space="preserve"> </w:t>
+            </w:r>
+            <w:r>
+              <w:t xml:space="preserve">IDENTICAL, sha256</w:t>
+            </w:r>
+            <w:r>
+              <w:t xml:space="preserve"> </w:t>
+            </w:r>
+            <w:r>
+              <w:rPr>
+                <w:rStyle w:val="VerbatimChar"/>
+              </w:rPr>
+              <w:t xml:space="preserve">14a006da…</w:t>
+            </w:r>
+            <w:r>
+              <w:t xml:space="preserve">), dark</w:t>
+            </w:r>
+            <w:r>
+              <w:t xml:space="preserve"> </w:t>
+            </w:r>
+            <w:r>
+              <w:rPr>
+                <w:rStyle w:val="VerbatimChar"/>
+              </w:rPr>
+              <w:t xml:space="preserve">--danger</w:t>
+            </w:r>
+            <w:r>
+              <w:t xml:space="preserve">→</w:t>
+            </w:r>
+            <w:r>
+              <w:rPr>
+                <w:rStyle w:val="VerbatimChar"/>
+              </w:rPr>
+              <w:t xml:space="preserve">#ef4444</w:t>
+            </w:r>
+            <w:r>
+              <w:t xml:space="preserve"> </w:t>
+            </w:r>
+            <w:r>
+              <w:t xml:space="preserve">(5.32 surface / 4.72 badgeTint), light</w:t>
+            </w:r>
+            <w:r>
+              <w:t xml:space="preserve"> </w:t>
+            </w:r>
+            <w:r>
+              <w:rPr>
+                <w:rStyle w:val="VerbatimChar"/>
+              </w:rPr>
+              <w:t xml:space="preserve">--warn</w:t>
+            </w:r>
+            <w:r>
+              <w:t xml:space="preserve">→</w:t>
+            </w:r>
+            <w:r>
+              <w:rPr>
+                <w:rStyle w:val="VerbatimChar"/>
+              </w:rPr>
+              <w:t xml:space="preserve">#854d0e</w:t>
+            </w:r>
+            <w:r>
+              <w:t xml:space="preserve"> </w:t>
+            </w:r>
+            <w:r>
+              <w:t xml:space="preserve">(6.85 / 5.46), light</w:t>
+            </w:r>
+            <w:r>
+              <w:t xml:space="preserve"> </w:t>
+            </w:r>
+            <w:r>
+              <w:rPr>
+                <w:rStyle w:val="VerbatimChar"/>
+              </w:rPr>
+              <w:t xml:space="preserve">--success</w:t>
+            </w:r>
+            <w:r>
+              <w:t xml:space="preserve">→</w:t>
+            </w:r>
+            <w:r>
+              <w:rPr>
+                <w:rStyle w:val="VerbatimChar"/>
+              </w:rPr>
+              <w:t xml:space="preserve">#166534</w:t>
+            </w:r>
+            <w:r>
+              <w:t xml:space="preserve"> </w:t>
+            </w:r>
+            <w:r>
+              <w:t xml:space="preserve">(7.13 / 5.66), light</w:t>
+            </w:r>
+            <w:r>
+              <w:t xml:space="preserve"> </w:t>
+            </w:r>
+            <w:r>
+              <w:rPr>
+                <w:rStyle w:val="VerbatimChar"/>
+              </w:rPr>
+              <w:t xml:space="preserve">--muted</w:t>
+            </w:r>
+            <w:r>
+              <w:t xml:space="preserve">→</w:t>
+            </w:r>
+            <w:r>
+              <w:rPr>
+                <w:rStyle w:val="VerbatimChar"/>
+              </w:rPr>
+              <w:t xml:space="preserve">#475569</w:t>
+            </w:r>
+            <w:r>
+              <w:t xml:space="preserve"> </w:t>
+            </w:r>
+            <w:r>
+              <w:t xml:space="preserve">(7.58),</w:t>
+            </w:r>
+            <w:r>
+              <w:t xml:space="preserve"> </w:t>
+            </w:r>
+            <w:r>
+              <w:rPr>
+                <w:rStyle w:val="VerbatimChar"/>
+              </w:rPr>
+              <w:t xml:space="preserve">--border-strong</w:t>
+            </w:r>
+            <w:r>
+              <w:t xml:space="preserve"> </w:t>
+            </w:r>
+            <w:r>
+              <w:rPr>
+                <w:rStyle w:val="VerbatimChar"/>
+              </w:rPr>
+              <w:t xml:space="preserve">#64748b</w:t>
+            </w:r>
+            <w:r>
+              <w:t xml:space="preserve"> </w:t>
+            </w:r>
+            <w:r>
+              <w:t xml:space="preserve">(4.76/4.34/4.20/3.07) — every value ≥ its AA bar under BOTH the 3:1 UI and stricter 4.5:1 text bars (A EVIDENCE.md §2,</w:t>
+            </w:r>
+            <w:r>
+              <w:t xml:space="preserve"> </w:t>
+            </w:r>
+            <w:r>
+              <w:rPr>
+                <w:rStyle w:val="VerbatimChar"/>
+              </w:rPr>
+              <w:t xml:space="preserve">contrast_final.py</w:t>
+            </w:r>
+            <w:r>
+              <w:t xml:space="preserve">). Host-render re-proof: dashboard 45/45 pass (this Rev-2 re-sync</w:t>
+            </w:r>
+            <w:r>
+              <w:t xml:space="preserve"> </w:t>
             </w:r>
             <w:r>
               <w:rPr>
@@ -4121,7 +5318,22 @@
               <w:t xml:space="preserve">cdce12c7</w:t>
             </w:r>
             <w:r>
-              <w:t xml:space="preserve">);</w:t>
+              <w:t xml:space="preserve">), ota-manager</w:t>
+            </w:r>
+            <w:r>
+              <w:t xml:space="preserve"> </w:t>
+            </w:r>
+            <w:r>
+              <w:rPr>
+                <w:rStyle w:val="VerbatimChar"/>
+              </w:rPr>
+              <w:t xml:space="preserve">OVERALL: PASS</w:t>
+            </w:r>
+            <w:r>
+              <w:t xml:space="preserve"> </w:t>
+            </w:r>
+            <w:r>
+              <w:t xml:space="preserve">self-validated.</w:t>
             </w:r>
             <w:r>
               <w:t xml:space="preserve"> </w:t>
@@ -4131,201 +5343,28 @@
                 <w:b/>
                 <w:bCs/>
               </w:rPr>
-              <w:t xml:space="preserve">ota-manager still owes its own shadcn audit</w:t>
-            </w:r>
-          </w:p>
-        </w:tc>
-        <w:tc>
-          <w:tcPr/>
-          <w:p>
-            <w:pPr>
-              <w:pStyle w:val="Compact"/>
-            </w:pPr>
-            <w:r>
-              <w:t xml:space="preserve">Landed: all three token copies byte-identical (</w:t>
-            </w:r>
-            <w:r>
-              <w:rPr>
-                <w:rStyle w:val="VerbatimChar"/>
-              </w:rPr>
-              <w:t xml:space="preserve">cmp</w:t>
-            </w:r>
-            <w:r>
-              <w:t xml:space="preserve"> </w:t>
-            </w:r>
-            <w:r>
-              <w:t xml:space="preserve">IDENTICAL, sha256</w:t>
-            </w:r>
-            <w:r>
-              <w:t xml:space="preserve"> </w:t>
-            </w:r>
-            <w:r>
-              <w:rPr>
-                <w:rStyle w:val="VerbatimChar"/>
-              </w:rPr>
-              <w:t xml:space="preserve">14a006da…</w:t>
-            </w:r>
-            <w:r>
-              <w:t xml:space="preserve">), dark</w:t>
-            </w:r>
-            <w:r>
-              <w:t xml:space="preserve"> </w:t>
-            </w:r>
-            <w:r>
-              <w:rPr>
-                <w:rStyle w:val="VerbatimChar"/>
-              </w:rPr>
-              <w:t xml:space="preserve">--danger</w:t>
-            </w:r>
-            <w:r>
-              <w:t xml:space="preserve">→</w:t>
-            </w:r>
-            <w:r>
-              <w:rPr>
-                <w:rStyle w:val="VerbatimChar"/>
-              </w:rPr>
-              <w:t xml:space="preserve">#ef4444</w:t>
-            </w:r>
-            <w:r>
-              <w:t xml:space="preserve"> </w:t>
-            </w:r>
-            <w:r>
-              <w:t xml:space="preserve">(5.32 surface / 4.72 badgeTint), light</w:t>
-            </w:r>
-            <w:r>
-              <w:t xml:space="preserve"> </w:t>
-            </w:r>
-            <w:r>
-              <w:rPr>
-                <w:rStyle w:val="VerbatimChar"/>
-              </w:rPr>
-              <w:t xml:space="preserve">--warn</w:t>
-            </w:r>
-            <w:r>
-              <w:t xml:space="preserve">→</w:t>
-            </w:r>
-            <w:r>
-              <w:rPr>
-                <w:rStyle w:val="VerbatimChar"/>
-              </w:rPr>
-              <w:t xml:space="preserve">#854d0e</w:t>
-            </w:r>
-            <w:r>
-              <w:t xml:space="preserve"> </w:t>
-            </w:r>
-            <w:r>
-              <w:t xml:space="preserve">(6.85 / 5.46), light</w:t>
-            </w:r>
-            <w:r>
-              <w:t xml:space="preserve"> </w:t>
-            </w:r>
-            <w:r>
-              <w:rPr>
-                <w:rStyle w:val="VerbatimChar"/>
-              </w:rPr>
-              <w:t xml:space="preserve">--success</w:t>
-            </w:r>
-            <w:r>
-              <w:t xml:space="preserve">→</w:t>
-            </w:r>
-            <w:r>
-              <w:rPr>
-                <w:rStyle w:val="VerbatimChar"/>
-              </w:rPr>
-              <w:t xml:space="preserve">#166534</w:t>
-            </w:r>
-            <w:r>
-              <w:t xml:space="preserve"> </w:t>
-            </w:r>
-            <w:r>
-              <w:t xml:space="preserve">(7.13 / 5.66), light</w:t>
-            </w:r>
-            <w:r>
-              <w:t xml:space="preserve"> </w:t>
-            </w:r>
-            <w:r>
-              <w:rPr>
-                <w:rStyle w:val="VerbatimChar"/>
-              </w:rPr>
-              <w:t xml:space="preserve">--muted</w:t>
-            </w:r>
-            <w:r>
-              <w:t xml:space="preserve">→</w:t>
-            </w:r>
-            <w:r>
-              <w:rPr>
-                <w:rStyle w:val="VerbatimChar"/>
-              </w:rPr>
-              <w:t xml:space="preserve">#475569</w:t>
-            </w:r>
-            <w:r>
-              <w:t xml:space="preserve"> </w:t>
-            </w:r>
-            <w:r>
-              <w:t xml:space="preserve">(7.58),</w:t>
-            </w:r>
-            <w:r>
-              <w:t xml:space="preserve"> </w:t>
-            </w:r>
-            <w:r>
-              <w:rPr>
-                <w:rStyle w:val="VerbatimChar"/>
-              </w:rPr>
-              <w:t xml:space="preserve">--border-strong</w:t>
-            </w:r>
-            <w:r>
-              <w:t xml:space="preserve"> </w:t>
-            </w:r>
-            <w:r>
-              <w:rPr>
-                <w:rStyle w:val="VerbatimChar"/>
-              </w:rPr>
-              <w:t xml:space="preserve">#64748b</w:t>
-            </w:r>
-            <w:r>
-              <w:t xml:space="preserve"> </w:t>
-            </w:r>
-            <w:r>
-              <w:t xml:space="preserve">(4.76/4.34/4.20/3.07) — every value ≥ its AA bar under BOTH the 3:1 UI and stricter 4.5:1 text bars (A EVIDENCE.md §2,</w:t>
-            </w:r>
-            <w:r>
-              <w:t xml:space="preserve"> </w:t>
-            </w:r>
-            <w:r>
-              <w:rPr>
-                <w:rStyle w:val="VerbatimChar"/>
-              </w:rPr>
-              <w:t xml:space="preserve">contrast_final.py</w:t>
-            </w:r>
-            <w:r>
-              <w:t xml:space="preserve">). Host-render re-proof: dashboard 45/45 pass (this Rev-2 re-sync</w:t>
-            </w:r>
-            <w:r>
-              <w:t xml:space="preserve"> </w:t>
-            </w:r>
-            <w:r>
-              <w:rPr>
-                <w:rStyle w:val="VerbatimChar"/>
-              </w:rPr>
-              <w:t xml:space="preserve">cdce12c7</w:t>
-            </w:r>
-            <w:r>
-              <w:t xml:space="preserve">), ota-manager</w:t>
-            </w:r>
-            <w:r>
-              <w:t xml:space="preserve"> </w:t>
-            </w:r>
-            <w:r>
-              <w:rPr>
-                <w:rStyle w:val="VerbatimChar"/>
-              </w:rPr>
-              <w:t xml:space="preserve">OVERALL: PASS</w:t>
-            </w:r>
-            <w:r>
-              <w:t xml:space="preserve"> </w:t>
-            </w:r>
-            <w:r>
-              <w:t xml:space="preserve">self-validated.</w:t>
+              <w:t xml:space="preserve">Finding (§11.4.6):</w:t>
+            </w:r>
+            <w:r>
+              <w:t xml:space="preserve"> </w:t>
+            </w:r>
+            <w:r>
+              <w:t xml:space="preserve">inert for ota-manager (shadcn</w:t>
+            </w:r>
+            <w:r>
+              <w:t xml:space="preserve"> </w:t>
+            </w:r>
+            <w:r>
+              <w:rPr>
+                <w:rStyle w:val="VerbatimChar"/>
+              </w:rPr>
+              <w:t xml:space="preserve">:root</w:t>
+            </w:r>
+            <w:r>
+              <w:t xml:space="preserve"> </w:t>
+            </w:r>
+            <w:r>
+              <w:t xml:space="preserve">HSL wins the cascade → new-vs-old render 0.0000%); a</w:t>
             </w:r>
             <w:r>
               <w:t xml:space="preserve"> </w:t>
@@ -4335,68 +5374,119 @@
                 <w:b/>
                 <w:bCs/>
               </w:rPr>
-              <w:t xml:space="preserve">Finding (§11.4.6):</w:t>
-            </w:r>
-            <w:r>
-              <w:t xml:space="preserve"> </w:t>
-            </w:r>
-            <w:r>
-              <w:t xml:space="preserve">inert for ota-manager (shadcn</w:t>
-            </w:r>
-            <w:r>
-              <w:t xml:space="preserve"> </w:t>
-            </w:r>
-            <w:r>
-              <w:rPr>
-                <w:rStyle w:val="VerbatimChar"/>
-              </w:rPr>
-              <w:t xml:space="preserve">:root</w:t>
-            </w:r>
-            <w:r>
-              <w:t xml:space="preserve"> </w:t>
-            </w:r>
-            <w:r>
-              <w:t xml:space="preserve">HSL wins the cascade → new-vs-old render 0.0000%); a</w:t>
-            </w:r>
-            <w:r>
-              <w:t xml:space="preserve"> </w:t>
-            </w:r>
+              <w:t xml:space="preserve">separate ota-manager shadcn-palette WCAG audit</w:t>
+            </w:r>
+            <w:r>
+              <w:t xml:space="preserve"> </w:t>
+            </w:r>
+            <w:r>
+              <w:t xml:space="preserve">is now the outstanding UI-polish item. Residual honest follow-up: light</w:t>
+            </w:r>
+            <w:r>
+              <w:t xml:space="preserve"> </w:t>
+            </w:r>
+            <w:r>
+              <w:rPr>
+                <w:rStyle w:val="VerbatimChar"/>
+              </w:rPr>
+              <w:t xml:space="preserve">--danger</w:t>
+            </w:r>
+            <w:r>
+              <w:t xml:space="preserve"> </w:t>
+            </w:r>
+            <w:r>
+              <w:rPr>
+                <w:rStyle w:val="VerbatimChar"/>
+              </w:rPr>
+              <w:t xml:space="preserve">#dc2626</w:t>
+            </w:r>
+            <w:r>
+              <w:t xml:space="preserve"> </w:t>
+            </w:r>
+            <w:r>
+              <w:t xml:space="preserve">= 3.81 on its own badge-tint (documented, not over-changed).</w:t>
+            </w:r>
+          </w:p>
+        </w:tc>
+      </w:tr>
+      <w:tr>
+        <w:tc>
+          <w:tcPr/>
+          <w:p>
+            <w:pPr>
+              <w:pStyle w:val="Compact"/>
+            </w:pPr>
             <w:r>
               <w:rPr>
                 <w:b/>
                 <w:bCs/>
               </w:rPr>
-              <w:t xml:space="preserve">separate ota-manager shadcn-palette WCAG audit</w:t>
-            </w:r>
-            <w:r>
-              <w:t xml:space="preserve"> </w:t>
-            </w:r>
-            <w:r>
-              <w:t xml:space="preserve">is now the outstanding UI-polish item. Residual honest follow-up: light</w:t>
-            </w:r>
-            <w:r>
-              <w:t xml:space="preserve"> </w:t>
-            </w:r>
-            <w:r>
-              <w:rPr>
-                <w:rStyle w:val="VerbatimChar"/>
-              </w:rPr>
-              <w:t xml:space="preserve">--danger</w:t>
-            </w:r>
-            <w:r>
-              <w:t xml:space="preserve"> </w:t>
-            </w:r>
-            <w:r>
-              <w:rPr>
-                <w:rStyle w:val="VerbatimChar"/>
-              </w:rPr>
-              <w:t xml:space="preserve">#dc2626</w:t>
-            </w:r>
-            <w:r>
-              <w:t xml:space="preserve"> </w:t>
-            </w:r>
-            <w:r>
-              <w:t xml:space="preserve">= 3.81 on its own badge-tint (documented, not over-changed).</w:t>
+              <w:t xml:space="preserve">ota-manager type errors 118 → 85</w:t>
+            </w:r>
+          </w:p>
+        </w:tc>
+        <w:tc>
+          <w:tcPr/>
+          <w:p>
+            <w:pPr>
+              <w:pStyle w:val="Compact"/>
+            </w:pPr>
+            <w:r>
+              <w:t xml:space="preserve">PARTIAL (33 fixed</w:t>
+            </w:r>
+            <w:r>
+              <w:t xml:space="preserve"> </w:t>
+            </w:r>
+            <w:r>
+              <w:rPr>
+                <w:rStyle w:val="VerbatimChar"/>
+              </w:rPr>
+              <w:t xml:space="preserve">34f7dcf6</w:t>
+            </w:r>
+            <w:r>
+              <w:t xml:space="preserve">); 85 OPERATOR-GATED</w:t>
+            </w:r>
+          </w:p>
+        </w:tc>
+        <w:tc>
+          <w:tcPr/>
+          <w:p>
+            <w:pPr>
+              <w:pStyle w:val="Compact"/>
+            </w:pPr>
+            <w:r>
+              <w:t xml:space="preserve">33 router-independent genuine bugs fixed; the</w:t>
+            </w:r>
+            <w:r>
+              <w:t xml:space="preserve"> </w:t>
+            </w:r>
+            <w:r>
+              <w:rPr>
+                <w:b/>
+                <w:bCs/>
+              </w:rPr>
+              <w:t xml:space="preserve">85 remaining are ALL in the operator-gated router/unrouted-page cluster</w:t>
+            </w:r>
+            <w:r>
+              <w:t xml:space="preserve"> </w:t>
+            </w:r>
+            <w:r>
+              <w:t xml:space="preserve">— they await the react-router-dom→tanstack reconciliation (item C). MEDIUM, bundled with the router UX decision. Stream Y also found</w:t>
+            </w:r>
+            <w:r>
+              <w:t xml:space="preserve"> </w:t>
+            </w:r>
+            <w:r>
+              <w:rPr>
+                <w:rStyle w:val="VerbatimChar"/>
+              </w:rPr>
+              <w:t xml:space="preserve">dashboard-page.tsx</w:t>
+            </w:r>
+            <w:r>
+              <w:t xml:space="preserve"> </w:t>
+            </w:r>
+            <w:r>
+              <w:t xml:space="preserve">is unwired dead code with 2 latent defects (feeds C).</w:t>
             </w:r>
           </w:p>
         </w:tc>
@@ -4413,53 +5503,62 @@
                 <w:b/>
                 <w:bCs/>
               </w:rPr>
-              <w:t xml:space="preserve">ota-manager 118 type errors</w:t>
-            </w:r>
-          </w:p>
-        </w:tc>
-        <w:tc>
-          <w:tcPr/>
-          <w:p>
-            <w:pPr>
-              <w:pStyle w:val="Compact"/>
-            </w:pPr>
-            <w:r>
-              <w:t xml:space="preserve">OPEN, tracked</w:t>
-            </w:r>
-          </w:p>
-        </w:tc>
-        <w:tc>
-          <w:tcPr/>
-          <w:p>
-            <w:pPr>
-              <w:pStyle w:val="Compact"/>
-            </w:pPr>
-            <w:r>
-              <w:t xml:space="preserve">Surfaced by the repaired</w:t>
-            </w:r>
-            <w:r>
-              <w:t xml:space="preserve"> </w:t>
-            </w:r>
-            <w:r>
-              <w:rPr>
-                <w:rStyle w:val="VerbatimChar"/>
-              </w:rPr>
-              <w:t xml:space="preserve">tsc</w:t>
-            </w:r>
-            <w:r>
-              <w:t xml:space="preserve"> </w:t>
-            </w:r>
-            <w:r>
-              <w:t xml:space="preserve">gate (</w:t>
-            </w:r>
-            <w:r>
-              <w:rPr>
-                <w:rStyle w:val="VerbatimChar"/>
-              </w:rPr>
-              <w:t xml:space="preserve">94fb10a2</w:t>
-            </w:r>
-            <w:r>
-              <w:t xml:space="preserve">). ~57 are on the dead unrouted feature pages. MEDIUM: does not block the shipped LoginPage render but blocks a clean type gate; bundle with router-wiring.</w:t>
+              <w:t xml:space="preserve">ota-manager feature pages unrouted</w:t>
+            </w:r>
+          </w:p>
+        </w:tc>
+        <w:tc>
+          <w:tcPr/>
+          <w:p>
+            <w:pPr>
+              <w:pStyle w:val="Compact"/>
+            </w:pPr>
+            <w:r>
+              <w:t xml:space="preserve">OPERATOR-GATED (§11.4.101)</w:t>
+            </w:r>
+          </w:p>
+        </w:tc>
+        <w:tc>
+          <w:tcPr/>
+          <w:p>
+            <w:pPr>
+              <w:pStyle w:val="Compact"/>
+            </w:pPr>
+            <w:r>
+              <w:t xml:space="preserve">Importable+tested but unwired; needs</w:t>
+            </w:r>
+            <w:r>
+              <w:t xml:space="preserve"> </w:t>
+            </w:r>
+            <w:r>
+              <w:rPr>
+                <w:rStyle w:val="VerbatimChar"/>
+              </w:rPr>
+              <w:t xml:space="preserve">react-router-dom</w:t>
+            </w:r>
+            <w:r>
+              <w:t xml:space="preserve">→</w:t>
+            </w:r>
+            <w:r>
+              <w:rPr>
+                <w:rStyle w:val="VerbatimChar"/>
+              </w:rPr>
+              <w:t xml:space="preserve">@tanstack/react-router</w:t>
+            </w:r>
+            <w:r>
+              <w:t xml:space="preserve"> </w:t>
+            </w:r>
+            <w:r>
+              <w:rPr>
+                <w:rStyle w:val="VerbatimChar"/>
+              </w:rPr>
+              <w:t xml:space="preserve">useNavigate</w:t>
+            </w:r>
+            <w:r>
+              <w:t xml:space="preserve"> </w:t>
+            </w:r>
+            <w:r>
+              <w:t xml:space="preserve">reconciliation + a UX decision. Do NOT auto-wire (CONTINUATION §5.C). MEDIUM, operator decision.</w:t>
             </w:r>
           </w:p>
         </w:tc>
@@ -4476,101 +5575,80 @@
                 <w:b/>
                 <w:bCs/>
               </w:rPr>
-              <w:t xml:space="preserve">ota-manager feature pages unrouted</w:t>
-            </w:r>
-          </w:p>
-        </w:tc>
-        <w:tc>
-          <w:tcPr/>
-          <w:p>
-            <w:pPr>
-              <w:pStyle w:val="Compact"/>
-            </w:pPr>
-            <w:r>
-              <w:t xml:space="preserve">OPERATOR-GATED (§11.4.101)</w:t>
-            </w:r>
-          </w:p>
-        </w:tc>
-        <w:tc>
-          <w:tcPr/>
-          <w:p>
-            <w:pPr>
-              <w:pStyle w:val="Compact"/>
-            </w:pPr>
-            <w:r>
-              <w:t xml:space="preserve">Importable+tested but unwired; needs</w:t>
-            </w:r>
-            <w:r>
-              <w:t xml:space="preserve"> </w:t>
-            </w:r>
-            <w:r>
-              <w:rPr>
-                <w:rStyle w:val="VerbatimChar"/>
-              </w:rPr>
-              <w:t xml:space="preserve">react-router-dom</w:t>
-            </w:r>
-            <w:r>
-              <w:t xml:space="preserve">→</w:t>
-            </w:r>
-            <w:r>
-              <w:rPr>
-                <w:rStyle w:val="VerbatimChar"/>
-              </w:rPr>
-              <w:t xml:space="preserve">@tanstack/react-router</w:t>
-            </w:r>
-            <w:r>
-              <w:t xml:space="preserve"> </w:t>
-            </w:r>
-            <w:r>
-              <w:rPr>
-                <w:rStyle w:val="VerbatimChar"/>
-              </w:rPr>
-              <w:t xml:space="preserve">useNavigate</w:t>
-            </w:r>
-            <w:r>
-              <w:t xml:space="preserve"> </w:t>
-            </w:r>
-            <w:r>
-              <w:t xml:space="preserve">reconciliation + a UX decision. Do NOT auto-wire (CONTINUATION §5.C). MEDIUM, operator decision.</w:t>
-            </w:r>
-          </w:p>
-        </w:tc>
-      </w:tr>
-      <w:tr>
-        <w:tc>
-          <w:tcPr/>
-          <w:p>
-            <w:pPr>
-              <w:pStyle w:val="Compact"/>
-            </w:pPr>
-            <w:r>
-              <w:rPr>
-                <w:b/>
-                <w:bCs/>
-              </w:rPr>
-              <w:t xml:space="preserve">Host-render matrix incomplete on ota-manager</w:t>
-            </w:r>
-          </w:p>
-        </w:tc>
-        <w:tc>
-          <w:tcPr/>
-          <w:p>
-            <w:pPr>
-              <w:pStyle w:val="Compact"/>
-            </w:pPr>
-            <w:r>
-              <w:t xml:space="preserve">OPEN</w:t>
-            </w:r>
-          </w:p>
-        </w:tc>
-        <w:tc>
-          <w:tcPr/>
-          <w:p>
-            <w:pPr>
-              <w:pStyle w:val="Compact"/>
-            </w:pPr>
-            <w:r>
-              <w:t xml:space="preserve">Only LoginPage proven; other screens owed (§5.F). MEDIUM — the visual-proof guarantee is per-screen; unproven screens are honest gaps, not silent PASS.</w:t>
+              <w:t xml:space="preserve">Host-render matrix on ota-manager</w:t>
+            </w:r>
+          </w:p>
+        </w:tc>
+        <w:tc>
+          <w:tcPr/>
+          <w:p>
+            <w:pPr>
+              <w:pStyle w:val="Compact"/>
+            </w:pPr>
+            <w:r>
+              <w:t xml:space="preserve">IMPROVED (2 screens)</w:t>
+            </w:r>
+          </w:p>
+        </w:tc>
+        <w:tc>
+          <w:tcPr/>
+          <w:p>
+            <w:pPr>
+              <w:pStyle w:val="Compact"/>
+            </w:pPr>
+            <w:r>
+              <w:t xml:space="preserve">LoginPage + shipped</w:t>
+            </w:r>
+            <w:r>
+              <w:t xml:space="preserve"> </w:t>
+            </w:r>
+            <w:r>
+              <w:rPr>
+                <w:rStyle w:val="VerbatimChar"/>
+              </w:rPr>
+              <w:t xml:space="preserve">/dashboard</w:t>
+            </w:r>
+            <w:r>
+              <w:t xml:space="preserve"> </w:t>
+            </w:r>
+            <w:r>
+              <w:t xml:space="preserve">now proven (</w:t>
+            </w:r>
+            <w:r>
+              <w:rPr>
+                <w:rStyle w:val="VerbatimChar"/>
+              </w:rPr>
+              <w:t xml:space="preserve">01947d8e</w:t>
+            </w:r>
+            <w:r>
+              <w:t xml:space="preserve">). The OTHER feature pages (</w:t>
+            </w:r>
+            <w:r>
+              <w:rPr>
+                <w:rStyle w:val="VerbatimChar"/>
+              </w:rPr>
+              <w:t xml:space="preserve">devices</w:t>
+            </w:r>
+            <w:r>
+              <w:t xml:space="preserve">/</w:t>
+            </w:r>
+            <w:r>
+              <w:rPr>
+                <w:rStyle w:val="VerbatimChar"/>
+              </w:rPr>
+              <w:t xml:space="preserve">releases</w:t>
+            </w:r>
+            <w:r>
+              <w:t xml:space="preserve">/</w:t>
+            </w:r>
+            <w:r>
+              <w:rPr>
+                <w:rStyle w:val="VerbatimChar"/>
+              </w:rPr>
+              <w:t xml:space="preserve">deployments</w:t>
+            </w:r>
+            <w:r>
+              <w:t xml:space="preserve">) are unrouted dead code pending the router decision C — not honest gaps to host-render until wired. LOW now.</w:t>
             </w:r>
           </w:p>
         </w:tc>
@@ -6228,7 +7306,7 @@
         </w:numPr>
       </w:pPr>
       <w:r>
-        <w:t xml:space="preserve">This is a</w:t>
+        <w:t xml:space="preserve">This ledger itself is a</w:t>
       </w:r>
       <w:r>
         <w:t xml:space="preserve"> </w:t>
@@ -6241,35 +7319,43 @@
         <w:t xml:space="preserve">consolidation of committed evidence</w:t>
       </w:r>
       <w:r>
-        <w:t xml:space="preserve">, produced read-only. It ran</w:t>
-      </w:r>
-      <w:r>
-        <w:t xml:space="preserve"> </w:t>
-      </w:r>
-      <w:r>
-        <w:rPr>
-          <w:b/>
-          <w:bCs/>
-        </w:rPr>
-        <w:t xml:space="preserve">no</w:t>
-      </w:r>
-      <w:r>
-        <w:t xml:space="preserve"> </w:t>
-      </w:r>
-      <w:r>
-        <w:t xml:space="preserve">build or test — verdicts cite the owning stream’s captured artifacts. Cells that</w:t>
-      </w:r>
-      <w:r>
-        <w:t xml:space="preserve"> </w:t>
-      </w:r>
-      <w:r>
-        <w:t xml:space="preserve">cannot be confirmed from a committed artifact (packaged-Tauri run, full-stack</w:t>
-      </w:r>
-      <w:r>
-        <w:t xml:space="preserve"> </w:t>
-      </w:r>
-      <w:r>
-        <w:t xml:space="preserve">dashboard-vs-real-Go-backend e2e) are marked</w:t>
+        <w:t xml:space="preserve">, produced read-only —</w:t>
+      </w:r>
+      <w:r>
+        <w:t xml:space="preserve"> </w:t>
+      </w:r>
+      <w:r>
+        <w:t xml:space="preserve">it ran no build or test; verdicts cite the owning stream’s captured artifacts (each</w:t>
+      </w:r>
+      <w:r>
+        <w:t xml:space="preserve"> </w:t>
+      </w:r>
+      <w:r>
+        <w:t xml:space="preserve">stream, e.g. the Postgres M2 stream, ran its own suite and produced its own EVIDENCE.md</w:t>
+      </w:r>
+      <w:r>
+        <w:t xml:space="preserve"> </w:t>
+      </w:r>
+      <w:r>
+        <w:t xml:space="preserve">under</w:t>
+      </w:r>
+      <w:r>
+        <w:t xml:space="preserve"> </w:t>
+      </w:r>
+      <w:r>
+        <w:rPr>
+          <w:rStyle w:val="VerbatimChar"/>
+        </w:rPr>
+        <w:t xml:space="preserve">docs/qa/</w:t>
+      </w:r>
+      <w:r>
+        <w:t xml:space="preserve">). Cells that cannot be confirmed from a committed artifact</w:t>
+      </w:r>
+      <w:r>
+        <w:t xml:space="preserve"> </w:t>
+      </w:r>
+      <w:r>
+        <w:t xml:space="preserve">(packaged-Tauri run, full-stack dashboard-vs-real-Go-backend e2e) are marked</w:t>
       </w:r>
       <w:r>
         <w:t xml:space="preserve"> </w:t>

</xml_diff>